<commit_message>
added all files back to new branch
</commit_message>
<xml_diff>
--- a/Power_Supply/Report/Report Template - Power Supply Design.docx
+++ b/Power_Supply/Report/Report Template - Power Supply Design.docx
@@ -1,6 +1,6 @@
 
 <file path=word/document.xml><?xml version="1.0" encoding="utf-8"?>
-<w:document xmlns:wpc="http://schemas.microsoft.com/office/word/2010/wordprocessingCanvas" xmlns:cx="http://schemas.microsoft.com/office/drawing/2014/chartex" xmlns:cx1="http://schemas.microsoft.com/office/drawing/2015/9/8/chartex" xmlns:cx2="http://schemas.microsoft.com/office/drawing/2015/10/21/chartex" xmlns:cx3="http://schemas.microsoft.com/office/drawing/2016/5/9/chartex" xmlns:cx4="http://schemas.microsoft.com/office/drawing/2016/5/10/chartex" xmlns:cx5="http://schemas.microsoft.com/office/drawing/2016/5/11/chartex" xmlns:cx6="http://schemas.microsoft.com/office/drawing/2016/5/12/chartex" xmlns:cx7="http://schemas.microsoft.com/office/drawing/2016/5/13/chartex" xmlns:cx8="http://schemas.microsoft.com/office/drawing/2016/5/14/chartex" xmlns:mc="http://schemas.openxmlformats.org/markup-compatibility/2006" xmlns:aink="http://schemas.microsoft.com/office/drawing/2016/ink" xmlns:am3d="http://schemas.microsoft.com/office/drawing/2017/model3d" xmlns:o="urn:schemas-microsoft-com:office:office" xmlns:oel="http://schemas.microsoft.com/office/2019/extlst" xmlns:r="http://schemas.openxmlformats.org/officeDocument/2006/relationships" xmlns:m="http://schemas.openxmlformats.org/officeDocument/2006/math" xmlns:v="urn:schemas-microsoft-com:vml" xmlns:wp14="http://schemas.microsoft.com/office/word/2010/wordprocessingDrawing" xmlns:wp="http://schemas.openxmlformats.org/drawingml/2006/wordprocessingDrawing" xmlns:w10="urn:schemas-microsoft-com:office:word" xmlns:w="http://schemas.openxmlformats.org/wordprocessingml/2006/main" xmlns:w14="http://schemas.microsoft.com/office/word/2010/wordml" xmlns:w15="http://schemas.microsoft.com/office/word/2012/wordml" xmlns:w16cex="http://schemas.microsoft.com/office/word/2018/wordml/cex" xmlns:w16cid="http://schemas.microsoft.com/office/word/2016/wordml/cid" xmlns:w16="http://schemas.microsoft.com/office/word/2018/wordml" xmlns:w16sdtdh="http://schemas.microsoft.com/office/word/2020/wordml/sdtdatahash" xmlns:w16se="http://schemas.microsoft.com/office/word/2015/wordml/symex" xmlns:wpg="http://schemas.microsoft.com/office/word/2010/wordprocessingGroup" xmlns:wpi="http://schemas.microsoft.com/office/word/2010/wordprocessingInk" xmlns:wne="http://schemas.microsoft.com/office/word/2006/wordml" xmlns:wps="http://schemas.microsoft.com/office/word/2010/wordprocessingShape" mc:Ignorable="w14 w15 w16se w16cid w16 w16cex w16sdtdh wp14">
+<w:document xmlns:wpc="http://schemas.microsoft.com/office/word/2010/wordprocessingCanvas" xmlns:cx="http://schemas.microsoft.com/office/drawing/2014/chartex" xmlns:cx1="http://schemas.microsoft.com/office/drawing/2015/9/8/chartex" xmlns:cx2="http://schemas.microsoft.com/office/drawing/2015/10/21/chartex" xmlns:cx3="http://schemas.microsoft.com/office/drawing/2016/5/9/chartex" xmlns:cx4="http://schemas.microsoft.com/office/drawing/2016/5/10/chartex" xmlns:cx5="http://schemas.microsoft.com/office/drawing/2016/5/11/chartex" xmlns:cx6="http://schemas.microsoft.com/office/drawing/2016/5/12/chartex" xmlns:cx7="http://schemas.microsoft.com/office/drawing/2016/5/13/chartex" xmlns:cx8="http://schemas.microsoft.com/office/drawing/2016/5/14/chartex" xmlns:mc="http://schemas.openxmlformats.org/markup-compatibility/2006" xmlns:aink="http://schemas.microsoft.com/office/drawing/2016/ink" xmlns:am3d="http://schemas.microsoft.com/office/drawing/2017/model3d" xmlns:o="urn:schemas-microsoft-com:office:office" xmlns:oel="http://schemas.microsoft.com/office/2019/extlst" xmlns:r="http://schemas.openxmlformats.org/officeDocument/2006/relationships" xmlns:m="http://schemas.openxmlformats.org/officeDocument/2006/math" xmlns:v="urn:schemas-microsoft-com:vml" xmlns:wp14="http://schemas.microsoft.com/office/word/2010/wordprocessingDrawing" xmlns:wp="http://schemas.openxmlformats.org/drawingml/2006/wordprocessingDrawing" xmlns:w10="urn:schemas-microsoft-com:office:word" xmlns:w="http://schemas.openxmlformats.org/wordprocessingml/2006/main" xmlns:w14="http://schemas.microsoft.com/office/word/2010/wordml" xmlns:w15="http://schemas.microsoft.com/office/word/2012/wordml" xmlns:w16cex="http://schemas.microsoft.com/office/word/2018/wordml/cex" xmlns:w16cid="http://schemas.microsoft.com/office/word/2016/wordml/cid" xmlns:w16="http://schemas.microsoft.com/office/word/2018/wordml" xmlns:w16du="http://schemas.microsoft.com/office/word/2023/wordml/word16du" xmlns:w16sdtdh="http://schemas.microsoft.com/office/word/2020/wordml/sdtdatahash" xmlns:w16sdtfl="http://schemas.microsoft.com/office/word/2024/wordml/sdtformatlock" xmlns:w16se="http://schemas.microsoft.com/office/word/2015/wordml/symex" xmlns:wpg="http://schemas.microsoft.com/office/word/2010/wordprocessingGroup" xmlns:wpi="http://schemas.microsoft.com/office/word/2010/wordprocessingInk" xmlns:wne="http://schemas.microsoft.com/office/word/2006/wordml" xmlns:wps="http://schemas.microsoft.com/office/word/2010/wordprocessingShape" mc:Ignorable="w14 w15 w16se w16cid w16 w16cex w16sdtdh w16sdtfl w16du wp14">
   <w:body>
     <w:p>
       <w:pPr>
@@ -15,7 +15,7 @@
           <w:b/>
           <w:sz w:val="24"/>
         </w:rPr>
-        <w:t>NAME</w:t>
+        <w:t>Sreeraaghav Raja</w:t>
       </w:r>
       <w:r>
         <w:rPr>
@@ -23,7 +23,13 @@
           <w:sz w:val="24"/>
         </w:rPr>
         <w:br/>
-        <w:t>DATE</w:t>
+      </w:r>
+      <w:r>
+        <w:rPr>
+          <w:b/>
+          <w:sz w:val="24"/>
+        </w:rPr>
+        <w:t>1/27/26</w:t>
       </w:r>
     </w:p>
     <w:p>
@@ -403,6 +409,178 @@
     <w:p>
       <w:pPr>
         <w:spacing w:after="0"/>
+        <w:rPr>
+          <w:sz w:val="24"/>
+        </w:rPr>
+      </w:pPr>
+    </w:p>
+    <w:p>
+      <w:pPr>
+        <w:spacing w:after="0"/>
+        <w:rPr>
+          <w:sz w:val="24"/>
+        </w:rPr>
+      </w:pPr>
+    </w:p>
+    <w:p>
+      <w:pPr>
+        <w:spacing w:after="0"/>
+        <w:rPr>
+          <w:sz w:val="24"/>
+        </w:rPr>
+      </w:pPr>
+    </w:p>
+    <w:p>
+      <w:pPr>
+        <w:keepNext/>
+        <w:spacing w:after="0"/>
+      </w:pPr>
+      <w:r>
+        <w:rPr>
+          <w:noProof/>
+          <w:sz w:val="24"/>
+        </w:rPr>
+        <w:drawing>
+          <wp:inline distT="0" distB="0" distL="0" distR="0" wp14:anchorId="4C705642" wp14:editId="7B46B9E2">
+            <wp:extent cx="5943600" cy="2160905"/>
+            <wp:effectExtent l="0" t="0" r="0" b="0"/>
+            <wp:docPr id="1173132620" name="Picture 1" descr="The image illustrates a schematic diagram of an electronic circuit, including components such as resistors, diodes, transistors, and capacitors, with various connections and labels indicating their positions and values.&#10;&#10;AI-generated content may be incorrect."/>
+            <wp:cNvGraphicFramePr>
+              <a:graphicFrameLocks xmlns:a="http://schemas.openxmlformats.org/drawingml/2006/main" noChangeAspect="1"/>
+            </wp:cNvGraphicFramePr>
+            <a:graphic xmlns:a="http://schemas.openxmlformats.org/drawingml/2006/main">
+              <a:graphicData uri="http://schemas.openxmlformats.org/drawingml/2006/picture">
+                <pic:pic xmlns:pic="http://schemas.openxmlformats.org/drawingml/2006/picture">
+                  <pic:nvPicPr>
+                    <pic:cNvPr id="1173132620" name="Picture 1" descr="The image illustrates a schematic diagram of an electronic circuit, including components such as resistors, diodes, transistors, and capacitors, with various connections and labels indicating their positions and values.&#10;&#10;AI-generated content may be incorrect."/>
+                    <pic:cNvPicPr/>
+                  </pic:nvPicPr>
+                  <pic:blipFill>
+                    <a:blip r:embed="rId8"/>
+                    <a:stretch>
+                      <a:fillRect/>
+                    </a:stretch>
+                  </pic:blipFill>
+                  <pic:spPr>
+                    <a:xfrm>
+                      <a:off x="0" y="0"/>
+                      <a:ext cx="5943600" cy="2160905"/>
+                    </a:xfrm>
+                    <a:prstGeom prst="rect">
+                      <a:avLst/>
+                    </a:prstGeom>
+                  </pic:spPr>
+                </pic:pic>
+              </a:graphicData>
+            </a:graphic>
+          </wp:inline>
+        </w:drawing>
+      </w:r>
+    </w:p>
+    <w:p>
+      <w:pPr>
+        <w:pStyle w:val="Caption"/>
+      </w:pPr>
+      <w:r>
+        <w:t xml:space="preserve">Figure </w:t>
+      </w:r>
+      <w:fldSimple w:instr=" SEQ Figure \* ARABIC ">
+        <w:r>
+          <w:rPr>
+            <w:noProof/>
+          </w:rPr>
+          <w:t>1</w:t>
+        </w:r>
+      </w:fldSimple>
+      <w:r>
+        <w:t>: Image of Linear (LDO) Voltage Regulator</w:t>
+      </w:r>
+    </w:p>
+    <w:p>
+      <w:pPr>
+        <w:pStyle w:val="Caption"/>
+        <w:keepNext/>
+      </w:pPr>
+      <w:r>
+        <w:rPr>
+          <w:noProof/>
+        </w:rPr>
+        <w:lastRenderedPageBreak/>
+        <w:drawing>
+          <wp:inline distT="0" distB="0" distL="0" distR="0" wp14:anchorId="63E201E1" wp14:editId="394C5F45">
+            <wp:extent cx="5943600" cy="2084705"/>
+            <wp:effectExtent l="0" t="0" r="0" b="0"/>
+            <wp:docPr id="1857954874" name="Picture 1" descr="The image illustrates a circuit diagram with various electronic components, such as resistors, diodes, transistors, and capacitors, connected in a layout that includes a voltage regulator (LM2576HV) and a filtering stage.&#10;&#10;AI-generated content may be incorrect."/>
+            <wp:cNvGraphicFramePr>
+              <a:graphicFrameLocks xmlns:a="http://schemas.openxmlformats.org/drawingml/2006/main" noChangeAspect="1"/>
+            </wp:cNvGraphicFramePr>
+            <a:graphic xmlns:a="http://schemas.openxmlformats.org/drawingml/2006/main">
+              <a:graphicData uri="http://schemas.openxmlformats.org/drawingml/2006/picture">
+                <pic:pic xmlns:pic="http://schemas.openxmlformats.org/drawingml/2006/picture">
+                  <pic:nvPicPr>
+                    <pic:cNvPr id="1857954874" name="Picture 1" descr="The image illustrates a circuit diagram with various electronic components, such as resistors, diodes, transistors, and capacitors, connected in a layout that includes a voltage regulator (LM2576HV) and a filtering stage.&#10;&#10;AI-generated content may be incorrect."/>
+                    <pic:cNvPicPr/>
+                  </pic:nvPicPr>
+                  <pic:blipFill>
+                    <a:blip r:embed="rId9"/>
+                    <a:stretch>
+                      <a:fillRect/>
+                    </a:stretch>
+                  </pic:blipFill>
+                  <pic:spPr>
+                    <a:xfrm>
+                      <a:off x="0" y="0"/>
+                      <a:ext cx="5943600" cy="2084705"/>
+                    </a:xfrm>
+                    <a:prstGeom prst="rect">
+                      <a:avLst/>
+                    </a:prstGeom>
+                  </pic:spPr>
+                </pic:pic>
+              </a:graphicData>
+            </a:graphic>
+          </wp:inline>
+        </w:drawing>
+      </w:r>
+    </w:p>
+    <w:p>
+      <w:pPr>
+        <w:pStyle w:val="Caption"/>
+      </w:pPr>
+      <w:r>
+        <w:t xml:space="preserve">Figure </w:t>
+      </w:r>
+      <w:fldSimple w:instr=" SEQ Figure \* ARABIC ">
+        <w:r>
+          <w:rPr>
+            <w:noProof/>
+          </w:rPr>
+          <w:t>2</w:t>
+        </w:r>
+      </w:fldSimple>
+      <w:r>
+        <w:t>: Image of Switching Voltage Regulator</w:t>
+      </w:r>
+    </w:p>
+    <w:p>
+      <w:pPr>
+        <w:spacing w:after="0"/>
+        <w:ind w:left="1080"/>
+        <w:rPr>
+          <w:sz w:val="24"/>
+        </w:rPr>
+      </w:pPr>
+    </w:p>
+    <w:p>
+      <w:pPr>
+        <w:keepNext/>
+        <w:spacing w:after="0"/>
+        <w:ind w:left="1080"/>
+      </w:pPr>
+    </w:p>
+    <w:p>
+      <w:pPr>
+        <w:spacing w:after="0"/>
         <w:ind w:left="1080"/>
         <w:rPr>
           <w:sz w:val="24"/>
@@ -624,16 +802,8 @@
         <w:rPr>
           <w:sz w:val="24"/>
         </w:rPr>
-        <w:t xml:space="preserve">initial transients </w:t>
-      </w:r>
-      <w:proofErr w:type="gramStart"/>
-      <w:r>
-        <w:rPr>
-          <w:sz w:val="24"/>
-        </w:rPr>
-        <w:t>dissipate</w:t>
-      </w:r>
-      <w:proofErr w:type="gramEnd"/>
+        <w:t>initial transients dissipate</w:t>
+      </w:r>
     </w:p>
     <w:p>
       <w:pPr>
@@ -758,13 +928,7 @@
         <w:rPr>
           <w:sz w:val="24"/>
         </w:rPr>
-        <w:t xml:space="preserve"> </w:t>
-      </w:r>
-      <w:r>
-        <w:rPr>
-          <w:sz w:val="24"/>
-        </w:rPr>
-        <w:t>for both regulators</w:t>
+        <w:t xml:space="preserve"> for both regulators</w:t>
       </w:r>
     </w:p>
     <w:p>
@@ -797,7 +961,6 @@
         <w:rPr>
           <w:sz w:val="24"/>
         </w:rPr>
-        <w:lastRenderedPageBreak/>
         <w:t>Discuss any discrepancies between simulation and measurement results</w:t>
       </w:r>
       <w:r>
@@ -900,6 +1063,7 @@
         <w:rPr>
           <w:sz w:val="24"/>
         </w:rPr>
+        <w:lastRenderedPageBreak/>
         <w:t>P</w:t>
       </w:r>
       <w:r>
@@ -924,21 +1088,7 @@
         <w:rPr>
           <w:sz w:val="24"/>
         </w:rPr>
-        <w:t xml:space="preserve">Do both </w:t>
-      </w:r>
-      <w:proofErr w:type="gramStart"/>
-      <w:r>
-        <w:rPr>
-          <w:sz w:val="24"/>
-        </w:rPr>
-        <w:t>supplies</w:t>
-      </w:r>
-      <w:proofErr w:type="gramEnd"/>
-      <w:r>
-        <w:rPr>
-          <w:sz w:val="24"/>
-        </w:rPr>
-        <w:t xml:space="preserve"> meet Voltage specs?</w:t>
+        <w:t>Do both supplies meet Voltage specs?</w:t>
       </w:r>
     </w:p>
     <w:p>
@@ -976,6 +1126,1351 @@
         </w:rPr>
         <w:t>Which supply is less noisy? Under which current load?</w:t>
       </w:r>
+    </w:p>
+    <w:p>
+      <w:pPr>
+        <w:spacing w:after="0"/>
+        <w:ind w:left="1440"/>
+        <w:rPr>
+          <w:sz w:val="24"/>
+        </w:rPr>
+      </w:pPr>
+    </w:p>
+    <w:p>
+      <w:pPr>
+        <w:keepNext/>
+        <w:spacing w:after="0"/>
+        <w:ind w:firstLine="720"/>
+      </w:pPr>
+      <w:r>
+        <w:rPr>
+          <w:noProof/>
+          <w:sz w:val="24"/>
+        </w:rPr>
+        <w:drawing>
+          <wp:inline distT="0" distB="0" distL="0" distR="0" wp14:anchorId="0146861D" wp14:editId="617A9999">
+            <wp:extent cx="5943600" cy="1385570"/>
+            <wp:effectExtent l="0" t="0" r="0" b="5080"/>
+            <wp:docPr id="1448258086" name="Picture 1"/>
+            <wp:cNvGraphicFramePr>
+              <a:graphicFrameLocks xmlns:a="http://schemas.openxmlformats.org/drawingml/2006/main" noChangeAspect="1"/>
+            </wp:cNvGraphicFramePr>
+            <a:graphic xmlns:a="http://schemas.openxmlformats.org/drawingml/2006/main">
+              <a:graphicData uri="http://schemas.openxmlformats.org/drawingml/2006/picture">
+                <pic:pic xmlns:pic="http://schemas.openxmlformats.org/drawingml/2006/picture">
+                  <pic:nvPicPr>
+                    <pic:cNvPr id="1448258086" name=""/>
+                    <pic:cNvPicPr/>
+                  </pic:nvPicPr>
+                  <pic:blipFill>
+                    <a:blip r:embed="rId10"/>
+                    <a:stretch>
+                      <a:fillRect/>
+                    </a:stretch>
+                  </pic:blipFill>
+                  <pic:spPr>
+                    <a:xfrm>
+                      <a:off x="0" y="0"/>
+                      <a:ext cx="5943600" cy="1385570"/>
+                    </a:xfrm>
+                    <a:prstGeom prst="rect">
+                      <a:avLst/>
+                    </a:prstGeom>
+                  </pic:spPr>
+                </pic:pic>
+              </a:graphicData>
+            </a:graphic>
+          </wp:inline>
+        </w:drawing>
+      </w:r>
+    </w:p>
+    <w:p>
+      <w:pPr>
+        <w:pStyle w:val="Caption"/>
+        <w:ind w:firstLine="720"/>
+      </w:pPr>
+      <w:r>
+        <w:t xml:space="preserve">Figure </w:t>
+      </w:r>
+      <w:fldSimple w:instr=" SEQ Figure \* ARABIC ">
+        <w:r>
+          <w:rPr>
+            <w:noProof/>
+          </w:rPr>
+          <w:t>3</w:t>
+        </w:r>
+      </w:fldSimple>
+      <w:r>
+        <w:rPr>
+          <w:noProof/>
+        </w:rPr>
+        <w:t>: Input Voltage</w:t>
+      </w:r>
+      <w:r>
+        <w:rPr>
+          <w:noProof/>
+        </w:rPr>
+        <w:t xml:space="preserve"> of Unregulated Voltage Circuit</w:t>
+      </w:r>
+    </w:p>
+    <w:p>
+      <w:pPr>
+        <w:pStyle w:val="Caption"/>
+        <w:ind w:firstLine="720"/>
+      </w:pPr>
+    </w:p>
+    <w:p>
+      <w:pPr>
+        <w:pStyle w:val="Caption"/>
+        <w:keepNext/>
+        <w:ind w:firstLine="720"/>
+      </w:pPr>
+      <w:r>
+        <w:rPr>
+          <w:noProof/>
+        </w:rPr>
+        <w:drawing>
+          <wp:inline distT="0" distB="0" distL="0" distR="0" wp14:anchorId="2B526F2E" wp14:editId="38E5CF3C">
+            <wp:extent cx="5943600" cy="1784985"/>
+            <wp:effectExtent l="0" t="0" r="0" b="5715"/>
+            <wp:docPr id="1559267085" name="Picture 1"/>
+            <wp:cNvGraphicFramePr>
+              <a:graphicFrameLocks xmlns:a="http://schemas.openxmlformats.org/drawingml/2006/main" noChangeAspect="1"/>
+            </wp:cNvGraphicFramePr>
+            <a:graphic xmlns:a="http://schemas.openxmlformats.org/drawingml/2006/main">
+              <a:graphicData uri="http://schemas.openxmlformats.org/drawingml/2006/picture">
+                <pic:pic xmlns:pic="http://schemas.openxmlformats.org/drawingml/2006/picture">
+                  <pic:nvPicPr>
+                    <pic:cNvPr id="1559267085" name=""/>
+                    <pic:cNvPicPr/>
+                  </pic:nvPicPr>
+                  <pic:blipFill>
+                    <a:blip r:embed="rId11"/>
+                    <a:stretch>
+                      <a:fillRect/>
+                    </a:stretch>
+                  </pic:blipFill>
+                  <pic:spPr>
+                    <a:xfrm>
+                      <a:off x="0" y="0"/>
+                      <a:ext cx="5943600" cy="1784985"/>
+                    </a:xfrm>
+                    <a:prstGeom prst="rect">
+                      <a:avLst/>
+                    </a:prstGeom>
+                  </pic:spPr>
+                </pic:pic>
+              </a:graphicData>
+            </a:graphic>
+          </wp:inline>
+        </w:drawing>
+      </w:r>
+    </w:p>
+    <w:p>
+      <w:pPr>
+        <w:pStyle w:val="Caption"/>
+        <w:ind w:firstLine="720"/>
+        <w:rPr>
+          <w:noProof/>
+        </w:rPr>
+      </w:pPr>
+      <w:r>
+        <w:t xml:space="preserve">Figure </w:t>
+      </w:r>
+      <w:fldSimple w:instr=" SEQ Figure \* ARABIC ">
+        <w:r>
+          <w:rPr>
+            <w:noProof/>
+          </w:rPr>
+          <w:t>4</w:t>
+        </w:r>
+      </w:fldSimple>
+      <w:r>
+        <w:rPr>
+          <w:noProof/>
+        </w:rPr>
+        <w:t xml:space="preserve">: </w:t>
+      </w:r>
+      <w:r>
+        <w:rPr>
+          <w:noProof/>
+        </w:rPr>
+        <w:t xml:space="preserve">Simulation </w:t>
+      </w:r>
+      <w:r>
+        <w:rPr>
+          <w:noProof/>
+        </w:rPr>
+        <w:t>Output of Transformer</w:t>
+      </w:r>
+      <w:r>
+        <w:rPr>
+          <w:noProof/>
+        </w:rPr>
+        <w:t xml:space="preserve"> Primary Stage</w:t>
+      </w:r>
+    </w:p>
+    <w:p>
+      <w:pPr>
+        <w:pStyle w:val="Caption"/>
+        <w:ind w:firstLine="720"/>
+        <w:rPr>
+          <w:noProof/>
+        </w:rPr>
+      </w:pPr>
+    </w:p>
+    <w:p>
+      <w:pPr>
+        <w:pStyle w:val="Caption"/>
+        <w:keepNext/>
+        <w:ind w:firstLine="720"/>
+      </w:pPr>
+      <w:r>
+        <w:rPr>
+          <w:noProof/>
+        </w:rPr>
+        <w:lastRenderedPageBreak/>
+        <w:drawing>
+          <wp:inline distT="0" distB="0" distL="0" distR="0" wp14:anchorId="3F3754CD" wp14:editId="7B1BB9D6">
+            <wp:extent cx="5943600" cy="3085465"/>
+            <wp:effectExtent l="0" t="0" r="0" b="635"/>
+            <wp:docPr id="573168216" name="Picture 1" descr="The image appears to be a schematic diagram of a voltage regulator, specifically a Low-Drop-Out (LDO) switching regulator, with various voltage levels marked from -3V to +3V, and time intervals from 0ms to 300ms.&#10;&#10;AI-generated content may be incorrect."/>
+            <wp:cNvGraphicFramePr>
+              <a:graphicFrameLocks xmlns:a="http://schemas.openxmlformats.org/drawingml/2006/main" noChangeAspect="1"/>
+            </wp:cNvGraphicFramePr>
+            <a:graphic xmlns:a="http://schemas.openxmlformats.org/drawingml/2006/main">
+              <a:graphicData uri="http://schemas.openxmlformats.org/drawingml/2006/picture">
+                <pic:pic xmlns:pic="http://schemas.openxmlformats.org/drawingml/2006/picture">
+                  <pic:nvPicPr>
+                    <pic:cNvPr id="573168216" name="Picture 1" descr="The image appears to be a schematic diagram of a voltage regulator, specifically a Low-Drop-Out (LDO) switching regulator, with various voltage levels marked from -3V to +3V, and time intervals from 0ms to 300ms.&#10;&#10;AI-generated content may be incorrect."/>
+                    <pic:cNvPicPr/>
+                  </pic:nvPicPr>
+                  <pic:blipFill>
+                    <a:blip r:embed="rId12"/>
+                    <a:stretch>
+                      <a:fillRect/>
+                    </a:stretch>
+                  </pic:blipFill>
+                  <pic:spPr>
+                    <a:xfrm>
+                      <a:off x="0" y="0"/>
+                      <a:ext cx="5943600" cy="3085465"/>
+                    </a:xfrm>
+                    <a:prstGeom prst="rect">
+                      <a:avLst/>
+                    </a:prstGeom>
+                  </pic:spPr>
+                </pic:pic>
+              </a:graphicData>
+            </a:graphic>
+          </wp:inline>
+        </w:drawing>
+      </w:r>
+    </w:p>
+    <w:p>
+      <w:pPr>
+        <w:pStyle w:val="Caption"/>
+        <w:ind w:firstLine="720"/>
+      </w:pPr>
+      <w:r>
+        <w:t xml:space="preserve">Figure </w:t>
+      </w:r>
+      <w:fldSimple w:instr=" SEQ Figure \* ARABIC ">
+        <w:r>
+          <w:rPr>
+            <w:noProof/>
+          </w:rPr>
+          <w:t>5</w:t>
+        </w:r>
+      </w:fldSimple>
+      <w:r>
+        <w:t>: Simulation Output of Transformer Secondary Stage</w:t>
+      </w:r>
+    </w:p>
+    <w:p>
+      <w:pPr>
+        <w:pStyle w:val="Caption"/>
+        <w:ind w:firstLine="720"/>
+      </w:pPr>
+    </w:p>
+    <w:p>
+      <w:pPr>
+        <w:spacing w:after="0"/>
+        <w:ind w:firstLine="720"/>
+        <w:rPr>
+          <w:sz w:val="24"/>
+        </w:rPr>
+      </w:pPr>
+    </w:p>
+    <w:p>
+      <w:pPr>
+        <w:keepNext/>
+        <w:spacing w:after="0"/>
+        <w:ind w:firstLine="720"/>
+      </w:pPr>
+      <w:r>
+        <w:rPr>
+          <w:noProof/>
+        </w:rPr>
+        <w:drawing>
+          <wp:inline distT="0" distB="0" distL="0" distR="0" wp14:anchorId="39EEB4A4" wp14:editId="4D47C661">
+            <wp:extent cx="5943600" cy="3112135"/>
+            <wp:effectExtent l="0" t="0" r="0" b="0"/>
+            <wp:docPr id="1089305830" name="Picture 1" descr="The image displays a voltage waveform with a descending pattern from 9.0V to 0.0V across a time span from 0ms to 300ms.&#10;&#10;AI-generated content may be incorrect."/>
+            <wp:cNvGraphicFramePr>
+              <a:graphicFrameLocks xmlns:a="http://schemas.openxmlformats.org/drawingml/2006/main" noChangeAspect="1"/>
+            </wp:cNvGraphicFramePr>
+            <a:graphic xmlns:a="http://schemas.openxmlformats.org/drawingml/2006/main">
+              <a:graphicData uri="http://schemas.openxmlformats.org/drawingml/2006/picture">
+                <pic:pic xmlns:pic="http://schemas.openxmlformats.org/drawingml/2006/picture">
+                  <pic:nvPicPr>
+                    <pic:cNvPr id="1089305830" name="Picture 1" descr="The image displays a voltage waveform with a descending pattern from 9.0V to 0.0V across a time span from 0ms to 300ms.&#10;&#10;AI-generated content may be incorrect."/>
+                    <pic:cNvPicPr/>
+                  </pic:nvPicPr>
+                  <pic:blipFill>
+                    <a:blip r:embed="rId13"/>
+                    <a:stretch>
+                      <a:fillRect/>
+                    </a:stretch>
+                  </pic:blipFill>
+                  <pic:spPr>
+                    <a:xfrm>
+                      <a:off x="0" y="0"/>
+                      <a:ext cx="5943600" cy="3112135"/>
+                    </a:xfrm>
+                    <a:prstGeom prst="rect">
+                      <a:avLst/>
+                    </a:prstGeom>
+                  </pic:spPr>
+                </pic:pic>
+              </a:graphicData>
+            </a:graphic>
+          </wp:inline>
+        </w:drawing>
+      </w:r>
+    </w:p>
+    <w:p>
+      <w:pPr>
+        <w:pStyle w:val="Caption"/>
+        <w:ind w:firstLine="720"/>
+      </w:pPr>
+      <w:r>
+        <w:t xml:space="preserve">Figure </w:t>
+      </w:r>
+      <w:fldSimple w:instr=" SEQ Figure \* ARABIC ">
+        <w:r>
+          <w:rPr>
+            <w:noProof/>
+          </w:rPr>
+          <w:t>6</w:t>
+        </w:r>
+      </w:fldSimple>
+      <w:r>
+        <w:rPr>
+          <w:noProof/>
+        </w:rPr>
+        <w:t xml:space="preserve">: Unregulated Voltage </w:t>
+      </w:r>
+      <w:r>
+        <w:rPr>
+          <w:noProof/>
+        </w:rPr>
+        <w:t xml:space="preserve">Simulation </w:t>
+      </w:r>
+      <w:r>
+        <w:rPr>
+          <w:noProof/>
+        </w:rPr>
+        <w:t>Output</w:t>
+      </w:r>
+      <w:r>
+        <w:t xml:space="preserve"> (Rectifier and Filtering Stage)</w:t>
+      </w:r>
+    </w:p>
+    <w:p>
+      <w:pPr>
+        <w:pStyle w:val="Caption"/>
+        <w:keepNext/>
+      </w:pPr>
+    </w:p>
+    <w:p>
+      <w:pPr>
+        <w:pStyle w:val="Caption"/>
+        <w:keepNext/>
+        <w:ind w:firstLine="720"/>
+      </w:pPr>
+      <w:r>
+        <w:rPr>
+          <w:noProof/>
+        </w:rPr>
+        <w:drawing>
+          <wp:inline distT="0" distB="0" distL="0" distR="0" wp14:anchorId="5148D093" wp14:editId="1484E196">
+            <wp:extent cx="5943600" cy="1510030"/>
+            <wp:effectExtent l="0" t="0" r="0" b="0"/>
+            <wp:docPr id="1724793095" name="Picture 1" descr="The image depicts an oscilloscope display showing a waveform for an output voltage (V(vout)) ranging from 5.5V down to 0.0V, with various voltage levels, intervals, and RMS values plotted.&#10;&#10;AI-generated content may be incorrect."/>
+            <wp:cNvGraphicFramePr>
+              <a:graphicFrameLocks xmlns:a="http://schemas.openxmlformats.org/drawingml/2006/main" noChangeAspect="1"/>
+            </wp:cNvGraphicFramePr>
+            <a:graphic xmlns:a="http://schemas.openxmlformats.org/drawingml/2006/main">
+              <a:graphicData uri="http://schemas.openxmlformats.org/drawingml/2006/picture">
+                <pic:pic xmlns:pic="http://schemas.openxmlformats.org/drawingml/2006/picture">
+                  <pic:nvPicPr>
+                    <pic:cNvPr id="1724793095" name="Picture 1" descr="The image depicts an oscilloscope display showing a waveform for an output voltage (V(vout)) ranging from 5.5V down to 0.0V, with various voltage levels, intervals, and RMS values plotted.&#10;&#10;AI-generated content may be incorrect."/>
+                    <pic:cNvPicPr/>
+                  </pic:nvPicPr>
+                  <pic:blipFill>
+                    <a:blip r:embed="rId14"/>
+                    <a:stretch>
+                      <a:fillRect/>
+                    </a:stretch>
+                  </pic:blipFill>
+                  <pic:spPr>
+                    <a:xfrm>
+                      <a:off x="0" y="0"/>
+                      <a:ext cx="5943600" cy="1510030"/>
+                    </a:xfrm>
+                    <a:prstGeom prst="rect">
+                      <a:avLst/>
+                    </a:prstGeom>
+                  </pic:spPr>
+                </pic:pic>
+              </a:graphicData>
+            </a:graphic>
+          </wp:inline>
+        </w:drawing>
+      </w:r>
+    </w:p>
+    <w:p>
+      <w:pPr>
+        <w:pStyle w:val="Caption"/>
+        <w:ind w:firstLine="720"/>
+      </w:pPr>
+      <w:r>
+        <w:t xml:space="preserve">Figure </w:t>
+      </w:r>
+      <w:fldSimple w:instr=" SEQ Figure \* ARABIC ">
+        <w:r>
+          <w:rPr>
+            <w:noProof/>
+          </w:rPr>
+          <w:t>7</w:t>
+        </w:r>
+      </w:fldSimple>
+      <w:r>
+        <w:rPr>
+          <w:noProof/>
+        </w:rPr>
+        <w:t>: Regulated Voltage Output (LDO Output)</w:t>
+      </w:r>
+      <w:r>
+        <w:t xml:space="preserve"> of 100mA Output</w:t>
+      </w:r>
+      <w:r>
+        <w:t xml:space="preserve"> (Simulation)</w:t>
+      </w:r>
+    </w:p>
+    <w:p>
+      <w:pPr>
+        <w:pStyle w:val="Caption"/>
+        <w:ind w:firstLine="720"/>
+      </w:pPr>
+    </w:p>
+    <w:p>
+      <w:pPr>
+        <w:pStyle w:val="Caption"/>
+        <w:keepNext/>
+        <w:ind w:firstLine="720"/>
+      </w:pPr>
+      <w:r>
+        <w:rPr>
+          <w:noProof/>
+        </w:rPr>
+        <w:drawing>
+          <wp:inline distT="0" distB="0" distL="0" distR="0" wp14:anchorId="0E5EAF36" wp14:editId="32E7A470">
+            <wp:extent cx="5943600" cy="1509395"/>
+            <wp:effectExtent l="0" t="0" r="0" b="0"/>
+            <wp:docPr id="1710259004" name="Picture 1" descr="The image depicts an oscilloscope display, showing an alternating current (AC) waveform with values ranging from 0 to -10 mA, and various intervals, average, and RMS (root mean square) measurements.&#10;&#10;AI-generated content may be incorrect."/>
+            <wp:cNvGraphicFramePr>
+              <a:graphicFrameLocks xmlns:a="http://schemas.openxmlformats.org/drawingml/2006/main" noChangeAspect="1"/>
+            </wp:cNvGraphicFramePr>
+            <a:graphic xmlns:a="http://schemas.openxmlformats.org/drawingml/2006/main">
+              <a:graphicData uri="http://schemas.openxmlformats.org/drawingml/2006/picture">
+                <pic:pic xmlns:pic="http://schemas.openxmlformats.org/drawingml/2006/picture">
+                  <pic:nvPicPr>
+                    <pic:cNvPr id="1710259004" name="Picture 1" descr="The image depicts an oscilloscope display, showing an alternating current (AC) waveform with values ranging from 0 to -10 mA, and various intervals, average, and RMS (root mean square) measurements.&#10;&#10;AI-generated content may be incorrect."/>
+                    <pic:cNvPicPr/>
+                  </pic:nvPicPr>
+                  <pic:blipFill>
+                    <a:blip r:embed="rId15"/>
+                    <a:stretch>
+                      <a:fillRect/>
+                    </a:stretch>
+                  </pic:blipFill>
+                  <pic:spPr>
+                    <a:xfrm>
+                      <a:off x="0" y="0"/>
+                      <a:ext cx="5943600" cy="1509395"/>
+                    </a:xfrm>
+                    <a:prstGeom prst="rect">
+                      <a:avLst/>
+                    </a:prstGeom>
+                  </pic:spPr>
+                </pic:pic>
+              </a:graphicData>
+            </a:graphic>
+          </wp:inline>
+        </w:drawing>
+      </w:r>
+    </w:p>
+    <w:p>
+      <w:pPr>
+        <w:pStyle w:val="Caption"/>
+        <w:ind w:firstLine="720"/>
+      </w:pPr>
+      <w:r>
+        <w:t xml:space="preserve">Figure </w:t>
+      </w:r>
+      <w:fldSimple w:instr=" SEQ Figure \* ARABIC ">
+        <w:r>
+          <w:rPr>
+            <w:noProof/>
+          </w:rPr>
+          <w:t>8</w:t>
+        </w:r>
+      </w:fldSimple>
+      <w:r>
+        <w:rPr>
+          <w:noProof/>
+        </w:rPr>
+        <w:t>: Regulated Current Output for 100mA</w:t>
+      </w:r>
+      <w:r>
+        <w:rPr>
+          <w:noProof/>
+        </w:rPr>
+        <w:t xml:space="preserve"> (Simulation)</w:t>
+      </w:r>
+    </w:p>
+    <w:p>
+      <w:pPr>
+        <w:pStyle w:val="Caption"/>
+        <w:ind w:firstLine="720"/>
+      </w:pPr>
+    </w:p>
+    <w:p>
+      <w:pPr>
+        <w:pStyle w:val="Caption"/>
+        <w:keepNext/>
+        <w:ind w:firstLine="720"/>
+      </w:pPr>
+      <w:r>
+        <w:rPr>
+          <w:noProof/>
+        </w:rPr>
+        <w:drawing>
+          <wp:inline distT="0" distB="0" distL="0" distR="0" wp14:anchorId="318749E1" wp14:editId="124D444E">
+            <wp:extent cx="5943600" cy="1391920"/>
+            <wp:effectExtent l="0" t="0" r="0" b="0"/>
+            <wp:docPr id="713094163" name="Picture 1"/>
+            <wp:cNvGraphicFramePr>
+              <a:graphicFrameLocks xmlns:a="http://schemas.openxmlformats.org/drawingml/2006/main" noChangeAspect="1"/>
+            </wp:cNvGraphicFramePr>
+            <a:graphic xmlns:a="http://schemas.openxmlformats.org/drawingml/2006/main">
+              <a:graphicData uri="http://schemas.openxmlformats.org/drawingml/2006/picture">
+                <pic:pic xmlns:pic="http://schemas.openxmlformats.org/drawingml/2006/picture">
+                  <pic:nvPicPr>
+                    <pic:cNvPr id="713094163" name=""/>
+                    <pic:cNvPicPr/>
+                  </pic:nvPicPr>
+                  <pic:blipFill>
+                    <a:blip r:embed="rId16"/>
+                    <a:stretch>
+                      <a:fillRect/>
+                    </a:stretch>
+                  </pic:blipFill>
+                  <pic:spPr>
+                    <a:xfrm>
+                      <a:off x="0" y="0"/>
+                      <a:ext cx="5943600" cy="1391920"/>
+                    </a:xfrm>
+                    <a:prstGeom prst="rect">
+                      <a:avLst/>
+                    </a:prstGeom>
+                  </pic:spPr>
+                </pic:pic>
+              </a:graphicData>
+            </a:graphic>
+          </wp:inline>
+        </w:drawing>
+      </w:r>
+    </w:p>
+    <w:p>
+      <w:pPr>
+        <w:pStyle w:val="Caption"/>
+        <w:ind w:firstLine="720"/>
+      </w:pPr>
+      <w:r>
+        <w:t xml:space="preserve">Figure </w:t>
+      </w:r>
+      <w:fldSimple w:instr=" SEQ Figure \* ARABIC ">
+        <w:r>
+          <w:rPr>
+            <w:noProof/>
+          </w:rPr>
+          <w:t>9</w:t>
+        </w:r>
+      </w:fldSimple>
+      <w:r>
+        <w:rPr>
+          <w:noProof/>
+        </w:rPr>
+        <w:t>: Regulated Output Voltage (LDO Output) of 5mA Output</w:t>
+      </w:r>
+    </w:p>
+    <w:p>
+      <w:pPr>
+        <w:pStyle w:val="Caption"/>
+        <w:ind w:firstLine="720"/>
+      </w:pPr>
+    </w:p>
+    <w:p>
+      <w:pPr>
+        <w:pStyle w:val="Caption"/>
+        <w:keepNext/>
+        <w:ind w:firstLine="720"/>
+      </w:pPr>
+      <w:r>
+        <w:rPr>
+          <w:noProof/>
+        </w:rPr>
+        <w:lastRenderedPageBreak/>
+        <w:drawing>
+          <wp:inline distT="0" distB="0" distL="0" distR="0" wp14:anchorId="335A89CF" wp14:editId="1ACF90A5">
+            <wp:extent cx="5943600" cy="1389380"/>
+            <wp:effectExtent l="0" t="0" r="0" b="1270"/>
+            <wp:docPr id="1207627917" name="Picture 1"/>
+            <wp:cNvGraphicFramePr>
+              <a:graphicFrameLocks xmlns:a="http://schemas.openxmlformats.org/drawingml/2006/main" noChangeAspect="1"/>
+            </wp:cNvGraphicFramePr>
+            <a:graphic xmlns:a="http://schemas.openxmlformats.org/drawingml/2006/main">
+              <a:graphicData uri="http://schemas.openxmlformats.org/drawingml/2006/picture">
+                <pic:pic xmlns:pic="http://schemas.openxmlformats.org/drawingml/2006/picture">
+                  <pic:nvPicPr>
+                    <pic:cNvPr id="1207627917" name=""/>
+                    <pic:cNvPicPr/>
+                  </pic:nvPicPr>
+                  <pic:blipFill>
+                    <a:blip r:embed="rId17"/>
+                    <a:stretch>
+                      <a:fillRect/>
+                    </a:stretch>
+                  </pic:blipFill>
+                  <pic:spPr>
+                    <a:xfrm>
+                      <a:off x="0" y="0"/>
+                      <a:ext cx="5943600" cy="1389380"/>
+                    </a:xfrm>
+                    <a:prstGeom prst="rect">
+                      <a:avLst/>
+                    </a:prstGeom>
+                  </pic:spPr>
+                </pic:pic>
+              </a:graphicData>
+            </a:graphic>
+          </wp:inline>
+        </w:drawing>
+      </w:r>
+    </w:p>
+    <w:p>
+      <w:pPr>
+        <w:pStyle w:val="Caption"/>
+        <w:ind w:firstLine="720"/>
+      </w:pPr>
+      <w:r>
+        <w:t xml:space="preserve">Figure </w:t>
+      </w:r>
+      <w:fldSimple w:instr=" SEQ Figure \* ARABIC ">
+        <w:r>
+          <w:rPr>
+            <w:noProof/>
+          </w:rPr>
+          <w:t>10</w:t>
+        </w:r>
+      </w:fldSimple>
+      <w:r>
+        <w:rPr>
+          <w:noProof/>
+        </w:rPr>
+        <w:t>: Regulated Current Output for 5mA</w:t>
+      </w:r>
+      <w:r>
+        <w:rPr>
+          <w:noProof/>
+        </w:rPr>
+        <w:t xml:space="preserve"> (Simulation)</w:t>
+      </w:r>
+    </w:p>
+    <w:p>
+      <w:pPr>
+        <w:pStyle w:val="Caption"/>
+        <w:ind w:firstLine="720"/>
+      </w:pPr>
+    </w:p>
+    <w:p>
+      <w:pPr>
+        <w:pStyle w:val="Caption"/>
+        <w:keepNext/>
+        <w:ind w:firstLine="720"/>
+      </w:pPr>
+      <w:r>
+        <w:rPr>
+          <w:noProof/>
+        </w:rPr>
+        <w:drawing>
+          <wp:inline distT="0" distB="0" distL="0" distR="0" wp14:anchorId="65DF6AD3" wp14:editId="2D802C94">
+            <wp:extent cx="5943600" cy="2446655"/>
+            <wp:effectExtent l="0" t="0" r="0" b="0"/>
+            <wp:docPr id="379712820" name="Picture 1"/>
+            <wp:cNvGraphicFramePr>
+              <a:graphicFrameLocks xmlns:a="http://schemas.openxmlformats.org/drawingml/2006/main" noChangeAspect="1"/>
+            </wp:cNvGraphicFramePr>
+            <a:graphic xmlns:a="http://schemas.openxmlformats.org/drawingml/2006/main">
+              <a:graphicData uri="http://schemas.openxmlformats.org/drawingml/2006/picture">
+                <pic:pic xmlns:pic="http://schemas.openxmlformats.org/drawingml/2006/picture">
+                  <pic:nvPicPr>
+                    <pic:cNvPr id="379712820" name=""/>
+                    <pic:cNvPicPr/>
+                  </pic:nvPicPr>
+                  <pic:blipFill>
+                    <a:blip r:embed="rId18"/>
+                    <a:stretch>
+                      <a:fillRect/>
+                    </a:stretch>
+                  </pic:blipFill>
+                  <pic:spPr>
+                    <a:xfrm>
+                      <a:off x="0" y="0"/>
+                      <a:ext cx="5943600" cy="2446655"/>
+                    </a:xfrm>
+                    <a:prstGeom prst="rect">
+                      <a:avLst/>
+                    </a:prstGeom>
+                  </pic:spPr>
+                </pic:pic>
+              </a:graphicData>
+            </a:graphic>
+          </wp:inline>
+        </w:drawing>
+      </w:r>
+    </w:p>
+    <w:p>
+      <w:pPr>
+        <w:pStyle w:val="Caption"/>
+        <w:ind w:firstLine="720"/>
+        <w:rPr>
+          <w:noProof/>
+        </w:rPr>
+      </w:pPr>
+      <w:r>
+        <w:t xml:space="preserve">Figure </w:t>
+      </w:r>
+      <w:fldSimple w:instr=" SEQ Figure \* ARABIC ">
+        <w:r>
+          <w:rPr>
+            <w:noProof/>
+          </w:rPr>
+          <w:t>11</w:t>
+        </w:r>
+      </w:fldSimple>
+      <w:r>
+        <w:rPr>
+          <w:noProof/>
+        </w:rPr>
+        <w:t>: All Readings in the Same Plot</w:t>
+      </w:r>
+      <w:r>
+        <w:rPr>
+          <w:noProof/>
+        </w:rPr>
+        <w:t xml:space="preserve"> for the Unregulated Voltage Output Circuit</w:t>
+      </w:r>
+    </w:p>
+    <w:p>
+      <w:pPr>
+        <w:pStyle w:val="Caption"/>
+        <w:ind w:firstLine="720"/>
+        <w:rPr>
+          <w:noProof/>
+        </w:rPr>
+      </w:pPr>
+    </w:p>
+    <w:p>
+      <w:pPr>
+        <w:pStyle w:val="Caption"/>
+        <w:ind w:firstLine="720"/>
+        <w:rPr>
+          <w:noProof/>
+        </w:rPr>
+      </w:pPr>
+    </w:p>
+    <w:p>
+      <w:pPr>
+        <w:pStyle w:val="Caption"/>
+        <w:keepNext/>
+        <w:ind w:firstLine="720"/>
+      </w:pPr>
+      <w:r>
+        <w:rPr>
+          <w:noProof/>
+        </w:rPr>
+        <w:lastRenderedPageBreak/>
+        <w:drawing>
+          <wp:inline distT="0" distB="0" distL="0" distR="0" wp14:anchorId="7340E39B" wp14:editId="4A0EF305">
+            <wp:extent cx="5943600" cy="2774315"/>
+            <wp:effectExtent l="0" t="0" r="0" b="6985"/>
+            <wp:docPr id="807588458" name="Picture 1" descr="The image is a schematic diagram of a switching regulator circuit, featuring various components like transistors, capacitors, and resistors, arranged to control voltage conversion.&#10;&#10;AI-generated content may be incorrect."/>
+            <wp:cNvGraphicFramePr>
+              <a:graphicFrameLocks xmlns:a="http://schemas.openxmlformats.org/drawingml/2006/main" noChangeAspect="1"/>
+            </wp:cNvGraphicFramePr>
+            <a:graphic xmlns:a="http://schemas.openxmlformats.org/drawingml/2006/main">
+              <a:graphicData uri="http://schemas.openxmlformats.org/drawingml/2006/picture">
+                <pic:pic xmlns:pic="http://schemas.openxmlformats.org/drawingml/2006/picture">
+                  <pic:nvPicPr>
+                    <pic:cNvPr id="807588458" name="Picture 1" descr="The image is a schematic diagram of a switching regulator circuit, featuring various components like transistors, capacitors, and resistors, arranged to control voltage conversion.&#10;&#10;AI-generated content may be incorrect."/>
+                    <pic:cNvPicPr/>
+                  </pic:nvPicPr>
+                  <pic:blipFill>
+                    <a:blip r:embed="rId19"/>
+                    <a:stretch>
+                      <a:fillRect/>
+                    </a:stretch>
+                  </pic:blipFill>
+                  <pic:spPr>
+                    <a:xfrm>
+                      <a:off x="0" y="0"/>
+                      <a:ext cx="5943600" cy="2774315"/>
+                    </a:xfrm>
+                    <a:prstGeom prst="rect">
+                      <a:avLst/>
+                    </a:prstGeom>
+                  </pic:spPr>
+                </pic:pic>
+              </a:graphicData>
+            </a:graphic>
+          </wp:inline>
+        </w:drawing>
+      </w:r>
+    </w:p>
+    <w:p>
+      <w:pPr>
+        <w:pStyle w:val="Caption"/>
+        <w:ind w:firstLine="720"/>
+        <w:rPr>
+          <w:noProof/>
+        </w:rPr>
+      </w:pPr>
+      <w:r>
+        <w:t xml:space="preserve">Figure </w:t>
+      </w:r>
+      <w:fldSimple w:instr=" SEQ Figure \* ARABIC ">
+        <w:r>
+          <w:rPr>
+            <w:noProof/>
+          </w:rPr>
+          <w:t>12</w:t>
+        </w:r>
+      </w:fldSimple>
+      <w:r>
+        <w:t>: Switching Regulator Circuit</w:t>
+      </w:r>
+    </w:p>
+    <w:p>
+      <w:pPr>
+        <w:pStyle w:val="Caption"/>
+        <w:ind w:firstLine="720"/>
+        <w:rPr>
+          <w:noProof/>
+        </w:rPr>
+      </w:pPr>
+    </w:p>
+    <w:p>
+      <w:pPr>
+        <w:pStyle w:val="Caption"/>
+        <w:keepNext/>
+        <w:ind w:firstLine="720"/>
+      </w:pPr>
+      <w:r>
+        <w:rPr>
+          <w:noProof/>
+        </w:rPr>
+        <w:drawing>
+          <wp:inline distT="0" distB="0" distL="0" distR="0" wp14:anchorId="518AD8CA" wp14:editId="69BB64BA">
+            <wp:extent cx="5943600" cy="2806065"/>
+            <wp:effectExtent l="0" t="0" r="0" b="0"/>
+            <wp:docPr id="1420963907" name="Picture 1" descr="The image appears to be a graph or chart depicting voltage levels (V) and current (I) across time (ms) for a specific electronic component, such as a switching regulator, with values plotted against each other.&#10;&#10;AI-generated content may be incorrect."/>
+            <wp:cNvGraphicFramePr>
+              <a:graphicFrameLocks xmlns:a="http://schemas.openxmlformats.org/drawingml/2006/main" noChangeAspect="1"/>
+            </wp:cNvGraphicFramePr>
+            <a:graphic xmlns:a="http://schemas.openxmlformats.org/drawingml/2006/main">
+              <a:graphicData uri="http://schemas.openxmlformats.org/drawingml/2006/picture">
+                <pic:pic xmlns:pic="http://schemas.openxmlformats.org/drawingml/2006/picture">
+                  <pic:nvPicPr>
+                    <pic:cNvPr id="1420963907" name="Picture 1" descr="The image appears to be a graph or chart depicting voltage levels (V) and current (I) across time (ms) for a specific electronic component, such as a switching regulator, with values plotted against each other.&#10;&#10;AI-generated content may be incorrect."/>
+                    <pic:cNvPicPr/>
+                  </pic:nvPicPr>
+                  <pic:blipFill>
+                    <a:blip r:embed="rId20"/>
+                    <a:stretch>
+                      <a:fillRect/>
+                    </a:stretch>
+                  </pic:blipFill>
+                  <pic:spPr>
+                    <a:xfrm>
+                      <a:off x="0" y="0"/>
+                      <a:ext cx="5943600" cy="2806065"/>
+                    </a:xfrm>
+                    <a:prstGeom prst="rect">
+                      <a:avLst/>
+                    </a:prstGeom>
+                  </pic:spPr>
+                </pic:pic>
+              </a:graphicData>
+            </a:graphic>
+          </wp:inline>
+        </w:drawing>
+      </w:r>
+    </w:p>
+    <w:p>
+      <w:pPr>
+        <w:pStyle w:val="Caption"/>
+        <w:ind w:firstLine="720"/>
+      </w:pPr>
+      <w:r>
+        <w:t xml:space="preserve">Figure </w:t>
+      </w:r>
+      <w:fldSimple w:instr=" SEQ Figure \* ARABIC ">
+        <w:r>
+          <w:rPr>
+            <w:noProof/>
+          </w:rPr>
+          <w:t>13</w:t>
+        </w:r>
+      </w:fldSimple>
+      <w:r>
+        <w:t xml:space="preserve">: Switching Regulator Output Current and Output Voltage </w:t>
+      </w:r>
+      <w:r>
+        <w:t xml:space="preserve">Plots for I = 100mA </w:t>
+      </w:r>
+    </w:p>
+    <w:p>
+      <w:pPr>
+        <w:spacing w:after="0"/>
+        <w:ind w:firstLine="720"/>
+        <w:rPr>
+          <w:sz w:val="24"/>
+        </w:rPr>
+      </w:pPr>
+    </w:p>
+    <w:p>
+      <w:pPr>
+        <w:keepNext/>
+        <w:spacing w:after="0"/>
+        <w:ind w:firstLine="720"/>
+      </w:pPr>
+      <w:r>
+        <w:rPr>
+          <w:noProof/>
+          <w:sz w:val="24"/>
+        </w:rPr>
+        <w:lastRenderedPageBreak/>
+        <w:drawing>
+          <wp:inline distT="0" distB="0" distL="0" distR="0" wp14:anchorId="26C6A3F3" wp14:editId="675DC89B">
+            <wp:extent cx="4303437" cy="2195195"/>
+            <wp:effectExtent l="0" t="0" r="1905" b="0"/>
+            <wp:docPr id="1487762761" name="Picture 1" descr="The image displays a waveform display with a sampled signal I(R3) showing an interval from 0 to 50 milliseconds, an average of 96.413 milliamps, and a root mean square (RMS) voltage of 98.939 milliamps.&#10;&#10;AI-generated content may be incorrect."/>
+            <wp:cNvGraphicFramePr>
+              <a:graphicFrameLocks xmlns:a="http://schemas.openxmlformats.org/drawingml/2006/main" noChangeAspect="1"/>
+            </wp:cNvGraphicFramePr>
+            <a:graphic xmlns:a="http://schemas.openxmlformats.org/drawingml/2006/main">
+              <a:graphicData uri="http://schemas.openxmlformats.org/drawingml/2006/picture">
+                <pic:pic xmlns:pic="http://schemas.openxmlformats.org/drawingml/2006/picture">
+                  <pic:nvPicPr>
+                    <pic:cNvPr id="1487762761" name="Picture 1" descr="The image displays a waveform display with a sampled signal I(R3) showing an interval from 0 to 50 milliseconds, an average of 96.413 milliamps, and a root mean square (RMS) voltage of 98.939 milliamps.&#10;&#10;AI-generated content may be incorrect."/>
+                    <pic:cNvPicPr/>
+                  </pic:nvPicPr>
+                  <pic:blipFill rotWithShape="1">
+                    <a:blip r:embed="rId21"/>
+                    <a:srcRect l="1858" t="4702" r="4843" b="4998"/>
+                    <a:stretch>
+                      <a:fillRect/>
+                    </a:stretch>
+                  </pic:blipFill>
+                  <pic:spPr bwMode="auto">
+                    <a:xfrm>
+                      <a:off x="0" y="0"/>
+                      <a:ext cx="4306867" cy="2196945"/>
+                    </a:xfrm>
+                    <a:prstGeom prst="rect">
+                      <a:avLst/>
+                    </a:prstGeom>
+                    <a:ln>
+                      <a:noFill/>
+                    </a:ln>
+                    <a:extLst>
+                      <a:ext uri="{53640926-AAD7-44D8-BBD7-CCE9431645EC}">
+                        <a14:shadowObscured xmlns:a14="http://schemas.microsoft.com/office/drawing/2010/main"/>
+                      </a:ext>
+                    </a:extLst>
+                  </pic:spPr>
+                </pic:pic>
+              </a:graphicData>
+            </a:graphic>
+          </wp:inline>
+        </w:drawing>
+      </w:r>
+    </w:p>
+    <w:p>
+      <w:pPr>
+        <w:pStyle w:val="Caption"/>
+        <w:ind w:firstLine="720"/>
+      </w:pPr>
+      <w:r>
+        <w:t xml:space="preserve">Figure </w:t>
+      </w:r>
+      <w:fldSimple w:instr=" SEQ Figure \* ARABIC ">
+        <w:r>
+          <w:rPr>
+            <w:noProof/>
+          </w:rPr>
+          <w:t>14</w:t>
+        </w:r>
+      </w:fldSimple>
+      <w:r>
+        <w:t>: Image of Current Output for Switching Regulator (Simulation)</w:t>
+      </w:r>
+    </w:p>
+    <w:p>
+      <w:pPr>
+        <w:keepNext/>
+        <w:spacing w:after="0"/>
+        <w:ind w:firstLine="720"/>
+      </w:pPr>
+      <w:r>
+        <w:rPr>
+          <w:noProof/>
+          <w:sz w:val="24"/>
+        </w:rPr>
+        <w:drawing>
+          <wp:inline distT="0" distB="0" distL="0" distR="0" wp14:anchorId="1A7DCD80" wp14:editId="2FD44939">
+            <wp:extent cx="4381500" cy="2288117"/>
+            <wp:effectExtent l="0" t="0" r="0" b="0"/>
+            <wp:docPr id="1795010085" name="Picture 1" descr="The image displays a waveform display on a device, showing a voltage (Vout) of 4.8206V RMS and 4.9469V, with an interval from 0 to 50 milliseconds.&#10;&#10;AI-generated content may be incorrect."/>
+            <wp:cNvGraphicFramePr>
+              <a:graphicFrameLocks xmlns:a="http://schemas.openxmlformats.org/drawingml/2006/main" noChangeAspect="1"/>
+            </wp:cNvGraphicFramePr>
+            <a:graphic xmlns:a="http://schemas.openxmlformats.org/drawingml/2006/main">
+              <a:graphicData uri="http://schemas.openxmlformats.org/drawingml/2006/picture">
+                <pic:pic xmlns:pic="http://schemas.openxmlformats.org/drawingml/2006/picture">
+                  <pic:nvPicPr>
+                    <pic:cNvPr id="1795010085" name="Picture 1" descr="The image displays a waveform display on a device, showing a voltage (Vout) of 4.8206V RMS and 4.9469V, with an interval from 0 to 50 milliseconds.&#10;&#10;AI-generated content may be incorrect."/>
+                    <pic:cNvPicPr/>
+                  </pic:nvPicPr>
+                  <pic:blipFill>
+                    <a:blip r:embed="rId22"/>
+                    <a:stretch>
+                      <a:fillRect/>
+                    </a:stretch>
+                  </pic:blipFill>
+                  <pic:spPr>
+                    <a:xfrm>
+                      <a:off x="0" y="0"/>
+                      <a:ext cx="4392563" cy="2293895"/>
+                    </a:xfrm>
+                    <a:prstGeom prst="rect">
+                      <a:avLst/>
+                    </a:prstGeom>
+                  </pic:spPr>
+                </pic:pic>
+              </a:graphicData>
+            </a:graphic>
+          </wp:inline>
+        </w:drawing>
+      </w:r>
+    </w:p>
+    <w:p>
+      <w:pPr>
+        <w:pStyle w:val="Caption"/>
+        <w:ind w:firstLine="720"/>
+      </w:pPr>
+      <w:r>
+        <w:t xml:space="preserve">Figure </w:t>
+      </w:r>
+      <w:fldSimple w:instr=" SEQ Figure \* ARABIC ">
+        <w:r>
+          <w:rPr>
+            <w:noProof/>
+          </w:rPr>
+          <w:t>15</w:t>
+        </w:r>
+      </w:fldSimple>
+      <w:r>
+        <w:t>: Image of Voltage Output for Switching Regulator</w:t>
+      </w:r>
+      <w:r>
+        <w:t xml:space="preserve"> (Simulation)</w:t>
+      </w:r>
+    </w:p>
+    <w:p>
+      <w:pPr>
+        <w:pStyle w:val="Caption"/>
+        <w:ind w:firstLine="720"/>
+      </w:pPr>
+    </w:p>
+    <w:p>
+      <w:pPr>
+        <w:pStyle w:val="Caption"/>
+        <w:keepNext/>
+        <w:ind w:firstLine="720"/>
+      </w:pPr>
+      <w:r>
+        <w:rPr>
+          <w:noProof/>
+        </w:rPr>
+        <w:lastRenderedPageBreak/>
+        <w:drawing>
+          <wp:inline distT="0" distB="0" distL="0" distR="0" wp14:anchorId="12A6C264" wp14:editId="1DC9F552">
+            <wp:extent cx="5943600" cy="3025140"/>
+            <wp:effectExtent l="0" t="0" r="0" b="3810"/>
+            <wp:docPr id="1502621302" name="Picture 1" descr="The image depicts a voltage waveform and current waveform for a switching regulator circuit, with values ranging from 0V to 6.6V for voltage and 0mA to -0.6mA for current, plotted over a time scale from 0ms to 50ms.&#10;&#10;AI-generated content may be incorrect."/>
+            <wp:cNvGraphicFramePr>
+              <a:graphicFrameLocks xmlns:a="http://schemas.openxmlformats.org/drawingml/2006/main" noChangeAspect="1"/>
+            </wp:cNvGraphicFramePr>
+            <a:graphic xmlns:a="http://schemas.openxmlformats.org/drawingml/2006/main">
+              <a:graphicData uri="http://schemas.openxmlformats.org/drawingml/2006/picture">
+                <pic:pic xmlns:pic="http://schemas.openxmlformats.org/drawingml/2006/picture">
+                  <pic:nvPicPr>
+                    <pic:cNvPr id="1502621302" name="Picture 1" descr="The image depicts a voltage waveform and current waveform for a switching regulator circuit, with values ranging from 0V to 6.6V for voltage and 0mA to -0.6mA for current, plotted over a time scale from 0ms to 50ms.&#10;&#10;AI-generated content may be incorrect."/>
+                    <pic:cNvPicPr/>
+                  </pic:nvPicPr>
+                  <pic:blipFill>
+                    <a:blip r:embed="rId23"/>
+                    <a:stretch>
+                      <a:fillRect/>
+                    </a:stretch>
+                  </pic:blipFill>
+                  <pic:spPr>
+                    <a:xfrm>
+                      <a:off x="0" y="0"/>
+                      <a:ext cx="5943600" cy="3025140"/>
+                    </a:xfrm>
+                    <a:prstGeom prst="rect">
+                      <a:avLst/>
+                    </a:prstGeom>
+                  </pic:spPr>
+                </pic:pic>
+              </a:graphicData>
+            </a:graphic>
+          </wp:inline>
+        </w:drawing>
+      </w:r>
+    </w:p>
+    <w:p>
+      <w:pPr>
+        <w:pStyle w:val="Caption"/>
+        <w:ind w:firstLine="720"/>
+      </w:pPr>
+      <w:r>
+        <w:t xml:space="preserve">Figure </w:t>
+      </w:r>
+      <w:fldSimple w:instr=" SEQ Figure \* ARABIC ">
+        <w:r>
+          <w:rPr>
+            <w:noProof/>
+          </w:rPr>
+          <w:t>16</w:t>
+        </w:r>
+      </w:fldSimple>
+      <w:r>
+        <w:t>: Switching Regulator Output Current and Output Voltage Plots for I = 5mA</w:t>
+      </w:r>
+    </w:p>
+    <w:p>
+      <w:pPr>
+        <w:pStyle w:val="Caption"/>
+        <w:ind w:firstLine="720"/>
+      </w:pPr>
+    </w:p>
+    <w:p>
+      <w:pPr>
+        <w:pStyle w:val="Caption"/>
+        <w:keepNext/>
+        <w:ind w:firstLine="720"/>
+      </w:pPr>
+      <w:r>
+        <w:rPr>
+          <w:noProof/>
+        </w:rPr>
+        <w:drawing>
+          <wp:inline distT="0" distB="0" distL="0" distR="0" wp14:anchorId="462B4F12" wp14:editId="06854573">
+            <wp:extent cx="3658248" cy="1871662"/>
+            <wp:effectExtent l="0" t="0" r="0" b="0"/>
+            <wp:docPr id="158091180" name="Picture 1" descr="The image displays a waveform graph with a positive current (I) of 4.8835 mA average and 5.007 mA RMS, measured across a 50 ms interval, starting at 0 seconds.&#10;&#10;AI-generated content may be incorrect."/>
+            <wp:cNvGraphicFramePr>
+              <a:graphicFrameLocks xmlns:a="http://schemas.openxmlformats.org/drawingml/2006/main" noChangeAspect="1"/>
+            </wp:cNvGraphicFramePr>
+            <a:graphic xmlns:a="http://schemas.openxmlformats.org/drawingml/2006/main">
+              <a:graphicData uri="http://schemas.openxmlformats.org/drawingml/2006/picture">
+                <pic:pic xmlns:pic="http://schemas.openxmlformats.org/drawingml/2006/picture">
+                  <pic:nvPicPr>
+                    <pic:cNvPr id="158091180" name="Picture 1" descr="The image displays a waveform graph with a positive current (I) of 4.8835 mA average and 5.007 mA RMS, measured across a 50 ms interval, starting at 0 seconds.&#10;&#10;AI-generated content may be incorrect."/>
+                    <pic:cNvPicPr/>
+                  </pic:nvPicPr>
+                  <pic:blipFill>
+                    <a:blip r:embed="rId24"/>
+                    <a:stretch>
+                      <a:fillRect/>
+                    </a:stretch>
+                  </pic:blipFill>
+                  <pic:spPr>
+                    <a:xfrm>
+                      <a:off x="0" y="0"/>
+                      <a:ext cx="3664429" cy="1874825"/>
+                    </a:xfrm>
+                    <a:prstGeom prst="rect">
+                      <a:avLst/>
+                    </a:prstGeom>
+                  </pic:spPr>
+                </pic:pic>
+              </a:graphicData>
+            </a:graphic>
+          </wp:inline>
+        </w:drawing>
+      </w:r>
+    </w:p>
+    <w:p>
+      <w:pPr>
+        <w:pStyle w:val="Caption"/>
+        <w:ind w:firstLine="720"/>
+      </w:pPr>
+      <w:r>
+        <w:t xml:space="preserve">Figure </w:t>
+      </w:r>
+      <w:fldSimple w:instr=" SEQ Figure \* ARABIC ">
+        <w:r>
+          <w:rPr>
+            <w:noProof/>
+          </w:rPr>
+          <w:t>17</w:t>
+        </w:r>
+      </w:fldSimple>
+      <w:r>
+        <w:t>: Image of</w:t>
+      </w:r>
+      <w:r>
+        <w:t xml:space="preserve"> Current</w:t>
+      </w:r>
+      <w:r>
+        <w:t xml:space="preserve"> Output for Switching Regulator</w:t>
+      </w:r>
+    </w:p>
+    <w:p>
+      <w:pPr>
+        <w:pStyle w:val="Caption"/>
+        <w:ind w:firstLine="720"/>
+      </w:pPr>
+    </w:p>
+    <w:p>
+      <w:pPr>
+        <w:pStyle w:val="Caption"/>
+        <w:keepNext/>
+        <w:ind w:firstLine="720"/>
+      </w:pPr>
+      <w:r>
+        <w:rPr>
+          <w:noProof/>
+        </w:rPr>
+        <w:lastRenderedPageBreak/>
+        <w:drawing>
+          <wp:inline distT="0" distB="0" distL="0" distR="0" wp14:anchorId="683CFD2A" wp14:editId="4436CFB7">
+            <wp:extent cx="3643313" cy="1841508"/>
+            <wp:effectExtent l="0" t="0" r="0" b="6350"/>
+            <wp:docPr id="863348069" name="Picture 1" descr="The image displays a waveform graph with the voltage output (V(vout)) showing an average value of 4.8835V and an RMS (root mean square) value of 5.007V, with time intervals marked at 50ms intervals.&#10;&#10;AI-generated content may be incorrect."/>
+            <wp:cNvGraphicFramePr>
+              <a:graphicFrameLocks xmlns:a="http://schemas.openxmlformats.org/drawingml/2006/main" noChangeAspect="1"/>
+            </wp:cNvGraphicFramePr>
+            <a:graphic xmlns:a="http://schemas.openxmlformats.org/drawingml/2006/main">
+              <a:graphicData uri="http://schemas.openxmlformats.org/drawingml/2006/picture">
+                <pic:pic xmlns:pic="http://schemas.openxmlformats.org/drawingml/2006/picture">
+                  <pic:nvPicPr>
+                    <pic:cNvPr id="863348069" name="Picture 1" descr="The image displays a waveform graph with the voltage output (V(vout)) showing an average value of 4.8835V and an RMS (root mean square) value of 5.007V, with time intervals marked at 50ms intervals.&#10;&#10;AI-generated content may be incorrect."/>
+                    <pic:cNvPicPr/>
+                  </pic:nvPicPr>
+                  <pic:blipFill>
+                    <a:blip r:embed="rId25"/>
+                    <a:stretch>
+                      <a:fillRect/>
+                    </a:stretch>
+                  </pic:blipFill>
+                  <pic:spPr>
+                    <a:xfrm>
+                      <a:off x="0" y="0"/>
+                      <a:ext cx="3649753" cy="1844763"/>
+                    </a:xfrm>
+                    <a:prstGeom prst="rect">
+                      <a:avLst/>
+                    </a:prstGeom>
+                  </pic:spPr>
+                </pic:pic>
+              </a:graphicData>
+            </a:graphic>
+          </wp:inline>
+        </w:drawing>
+      </w:r>
+    </w:p>
+    <w:p>
+      <w:pPr>
+        <w:pStyle w:val="Caption"/>
+        <w:ind w:firstLine="720"/>
+      </w:pPr>
+      <w:r>
+        <w:t xml:space="preserve">Figure </w:t>
+      </w:r>
+      <w:fldSimple w:instr=" SEQ Figure \* ARABIC ">
+        <w:r>
+          <w:rPr>
+            <w:noProof/>
+          </w:rPr>
+          <w:t>18</w:t>
+        </w:r>
+      </w:fldSimple>
+      <w:r>
+        <w:t xml:space="preserve">: Image of </w:t>
+      </w:r>
+      <w:r>
+        <w:t>Voltage</w:t>
+      </w:r>
+      <w:r>
+        <w:t xml:space="preserve"> Output for Switching Regulator</w:t>
+      </w:r>
+    </w:p>
+    <w:p>
+      <w:pPr>
+        <w:spacing w:after="0"/>
+        <w:ind w:firstLine="720"/>
+        <w:rPr>
+          <w:sz w:val="24"/>
+        </w:rPr>
+      </w:pPr>
+    </w:p>
+    <w:p>
+      <w:pPr>
+        <w:spacing w:after="0"/>
+        <w:ind w:firstLine="720"/>
+        <w:rPr>
+          <w:sz w:val="24"/>
+        </w:rPr>
+      </w:pPr>
     </w:p>
     <w:p>
       <w:pPr>
@@ -1137,8 +2632,58 @@
 </w:document>
 </file>
 
+<file path=word/endnotes.xml><?xml version="1.0" encoding="utf-8"?>
+<w:endnotes xmlns:wpc="http://schemas.microsoft.com/office/word/2010/wordprocessingCanvas" xmlns:cx="http://schemas.microsoft.com/office/drawing/2014/chartex" xmlns:cx1="http://schemas.microsoft.com/office/drawing/2015/9/8/chartex" xmlns:cx2="http://schemas.microsoft.com/office/drawing/2015/10/21/chartex" xmlns:cx3="http://schemas.microsoft.com/office/drawing/2016/5/9/chartex" xmlns:cx4="http://schemas.microsoft.com/office/drawing/2016/5/10/chartex" xmlns:cx5="http://schemas.microsoft.com/office/drawing/2016/5/11/chartex" xmlns:cx6="http://schemas.microsoft.com/office/drawing/2016/5/12/chartex" xmlns:cx7="http://schemas.microsoft.com/office/drawing/2016/5/13/chartex" xmlns:cx8="http://schemas.microsoft.com/office/drawing/2016/5/14/chartex" xmlns:mc="http://schemas.openxmlformats.org/markup-compatibility/2006" xmlns:aink="http://schemas.microsoft.com/office/drawing/2016/ink" xmlns:am3d="http://schemas.microsoft.com/office/drawing/2017/model3d" xmlns:o="urn:schemas-microsoft-com:office:office" xmlns:oel="http://schemas.microsoft.com/office/2019/extlst" xmlns:r="http://schemas.openxmlformats.org/officeDocument/2006/relationships" xmlns:m="http://schemas.openxmlformats.org/officeDocument/2006/math" xmlns:v="urn:schemas-microsoft-com:vml" xmlns:wp14="http://schemas.microsoft.com/office/word/2010/wordprocessingDrawing" xmlns:wp="http://schemas.openxmlformats.org/drawingml/2006/wordprocessingDrawing" xmlns:w10="urn:schemas-microsoft-com:office:word" xmlns:w="http://schemas.openxmlformats.org/wordprocessingml/2006/main" xmlns:w14="http://schemas.microsoft.com/office/word/2010/wordml" xmlns:w15="http://schemas.microsoft.com/office/word/2012/wordml" xmlns:w16cex="http://schemas.microsoft.com/office/word/2018/wordml/cex" xmlns:w16cid="http://schemas.microsoft.com/office/word/2016/wordml/cid" xmlns:w16="http://schemas.microsoft.com/office/word/2018/wordml" xmlns:w16du="http://schemas.microsoft.com/office/word/2023/wordml/word16du" xmlns:w16sdtdh="http://schemas.microsoft.com/office/word/2020/wordml/sdtdatahash" xmlns:w16sdtfl="http://schemas.microsoft.com/office/word/2024/wordml/sdtformatlock" xmlns:w16se="http://schemas.microsoft.com/office/word/2015/wordml/symex" xmlns:wpg="http://schemas.microsoft.com/office/word/2010/wordprocessingGroup" xmlns:wpi="http://schemas.microsoft.com/office/word/2010/wordprocessingInk" xmlns:wne="http://schemas.microsoft.com/office/word/2006/wordml" xmlns:wps="http://schemas.microsoft.com/office/word/2010/wordprocessingShape" mc:Ignorable="w14 w15 w16se w16cid w16 w16cex w16sdtdh w16sdtfl w16du wp14">
+  <w:endnote w:type="separator" w:id="-1">
+    <w:p>
+      <w:pPr>
+        <w:spacing w:after="0" w:line="240" w:lineRule="auto"/>
+      </w:pPr>
+      <w:r>
+        <w:separator/>
+      </w:r>
+    </w:p>
+  </w:endnote>
+  <w:endnote w:type="continuationSeparator" w:id="0">
+    <w:p>
+      <w:pPr>
+        <w:spacing w:after="0" w:line="240" w:lineRule="auto"/>
+      </w:pPr>
+      <w:r>
+        <w:continuationSeparator/>
+      </w:r>
+    </w:p>
+  </w:endnote>
+</w:endnotes>
+</file>
+
+<file path=word/footnotes.xml><?xml version="1.0" encoding="utf-8"?>
+<w:footnotes xmlns:wpc="http://schemas.microsoft.com/office/word/2010/wordprocessingCanvas" xmlns:cx="http://schemas.microsoft.com/office/drawing/2014/chartex" xmlns:cx1="http://schemas.microsoft.com/office/drawing/2015/9/8/chartex" xmlns:cx2="http://schemas.microsoft.com/office/drawing/2015/10/21/chartex" xmlns:cx3="http://schemas.microsoft.com/office/drawing/2016/5/9/chartex" xmlns:cx4="http://schemas.microsoft.com/office/drawing/2016/5/10/chartex" xmlns:cx5="http://schemas.microsoft.com/office/drawing/2016/5/11/chartex" xmlns:cx6="http://schemas.microsoft.com/office/drawing/2016/5/12/chartex" xmlns:cx7="http://schemas.microsoft.com/office/drawing/2016/5/13/chartex" xmlns:cx8="http://schemas.microsoft.com/office/drawing/2016/5/14/chartex" xmlns:mc="http://schemas.openxmlformats.org/markup-compatibility/2006" xmlns:aink="http://schemas.microsoft.com/office/drawing/2016/ink" xmlns:am3d="http://schemas.microsoft.com/office/drawing/2017/model3d" xmlns:o="urn:schemas-microsoft-com:office:office" xmlns:oel="http://schemas.microsoft.com/office/2019/extlst" xmlns:r="http://schemas.openxmlformats.org/officeDocument/2006/relationships" xmlns:m="http://schemas.openxmlformats.org/officeDocument/2006/math" xmlns:v="urn:schemas-microsoft-com:vml" xmlns:wp14="http://schemas.microsoft.com/office/word/2010/wordprocessingDrawing" xmlns:wp="http://schemas.openxmlformats.org/drawingml/2006/wordprocessingDrawing" xmlns:w10="urn:schemas-microsoft-com:office:word" xmlns:w="http://schemas.openxmlformats.org/wordprocessingml/2006/main" xmlns:w14="http://schemas.microsoft.com/office/word/2010/wordml" xmlns:w15="http://schemas.microsoft.com/office/word/2012/wordml" xmlns:w16cex="http://schemas.microsoft.com/office/word/2018/wordml/cex" xmlns:w16cid="http://schemas.microsoft.com/office/word/2016/wordml/cid" xmlns:w16="http://schemas.microsoft.com/office/word/2018/wordml" xmlns:w16du="http://schemas.microsoft.com/office/word/2023/wordml/word16du" xmlns:w16sdtdh="http://schemas.microsoft.com/office/word/2020/wordml/sdtdatahash" xmlns:w16sdtfl="http://schemas.microsoft.com/office/word/2024/wordml/sdtformatlock" xmlns:w16se="http://schemas.microsoft.com/office/word/2015/wordml/symex" xmlns:wpg="http://schemas.microsoft.com/office/word/2010/wordprocessingGroup" xmlns:wpi="http://schemas.microsoft.com/office/word/2010/wordprocessingInk" xmlns:wne="http://schemas.microsoft.com/office/word/2006/wordml" xmlns:wps="http://schemas.microsoft.com/office/word/2010/wordprocessingShape" mc:Ignorable="w14 w15 w16se w16cid w16 w16cex w16sdtdh w16sdtfl w16du wp14">
+  <w:footnote w:type="separator" w:id="-1">
+    <w:p>
+      <w:pPr>
+        <w:spacing w:after="0" w:line="240" w:lineRule="auto"/>
+      </w:pPr>
+      <w:r>
+        <w:separator/>
+      </w:r>
+    </w:p>
+  </w:footnote>
+  <w:footnote w:type="continuationSeparator" w:id="0">
+    <w:p>
+      <w:pPr>
+        <w:spacing w:after="0" w:line="240" w:lineRule="auto"/>
+      </w:pPr>
+      <w:r>
+        <w:continuationSeparator/>
+      </w:r>
+    </w:p>
+  </w:footnote>
+</w:footnotes>
+</file>
+
 <file path=word/numbering.xml><?xml version="1.0" encoding="utf-8"?>
-<w:numbering xmlns:wpc="http://schemas.microsoft.com/office/word/2010/wordprocessingCanvas" xmlns:cx="http://schemas.microsoft.com/office/drawing/2014/chartex" xmlns:cx1="http://schemas.microsoft.com/office/drawing/2015/9/8/chartex" xmlns:cx2="http://schemas.microsoft.com/office/drawing/2015/10/21/chartex" xmlns:cx3="http://schemas.microsoft.com/office/drawing/2016/5/9/chartex" xmlns:cx4="http://schemas.microsoft.com/office/drawing/2016/5/10/chartex" xmlns:cx5="http://schemas.microsoft.com/office/drawing/2016/5/11/chartex" xmlns:cx6="http://schemas.microsoft.com/office/drawing/2016/5/12/chartex" xmlns:cx7="http://schemas.microsoft.com/office/drawing/2016/5/13/chartex" xmlns:cx8="http://schemas.microsoft.com/office/drawing/2016/5/14/chartex" xmlns:mc="http://schemas.openxmlformats.org/markup-compatibility/2006" xmlns:aink="http://schemas.microsoft.com/office/drawing/2016/ink" xmlns:am3d="http://schemas.microsoft.com/office/drawing/2017/model3d" xmlns:o="urn:schemas-microsoft-com:office:office" xmlns:oel="http://schemas.microsoft.com/office/2019/extlst" xmlns:r="http://schemas.openxmlformats.org/officeDocument/2006/relationships" xmlns:m="http://schemas.openxmlformats.org/officeDocument/2006/math" xmlns:v="urn:schemas-microsoft-com:vml" xmlns:wp14="http://schemas.microsoft.com/office/word/2010/wordprocessingDrawing" xmlns:wp="http://schemas.openxmlformats.org/drawingml/2006/wordprocessingDrawing" xmlns:w10="urn:schemas-microsoft-com:office:word" xmlns:w="http://schemas.openxmlformats.org/wordprocessingml/2006/main" xmlns:w14="http://schemas.microsoft.com/office/word/2010/wordml" xmlns:w15="http://schemas.microsoft.com/office/word/2012/wordml" xmlns:w16cex="http://schemas.microsoft.com/office/word/2018/wordml/cex" xmlns:w16cid="http://schemas.microsoft.com/office/word/2016/wordml/cid" xmlns:w16="http://schemas.microsoft.com/office/word/2018/wordml" xmlns:w16sdtdh="http://schemas.microsoft.com/office/word/2020/wordml/sdtdatahash" xmlns:w16se="http://schemas.microsoft.com/office/word/2015/wordml/symex" xmlns:wpg="http://schemas.microsoft.com/office/word/2010/wordprocessingGroup" xmlns:wpi="http://schemas.microsoft.com/office/word/2010/wordprocessingInk" xmlns:wne="http://schemas.microsoft.com/office/word/2006/wordml" xmlns:wps="http://schemas.microsoft.com/office/word/2010/wordprocessingShape" mc:Ignorable="w14 w15 w16se w16cid w16 w16cex w16sdtdh wp14">
+<w:numbering xmlns:wpc="http://schemas.microsoft.com/office/word/2010/wordprocessingCanvas" xmlns:cx="http://schemas.microsoft.com/office/drawing/2014/chartex" xmlns:cx1="http://schemas.microsoft.com/office/drawing/2015/9/8/chartex" xmlns:cx2="http://schemas.microsoft.com/office/drawing/2015/10/21/chartex" xmlns:cx3="http://schemas.microsoft.com/office/drawing/2016/5/9/chartex" xmlns:cx4="http://schemas.microsoft.com/office/drawing/2016/5/10/chartex" xmlns:cx5="http://schemas.microsoft.com/office/drawing/2016/5/11/chartex" xmlns:cx6="http://schemas.microsoft.com/office/drawing/2016/5/12/chartex" xmlns:cx7="http://schemas.microsoft.com/office/drawing/2016/5/13/chartex" xmlns:cx8="http://schemas.microsoft.com/office/drawing/2016/5/14/chartex" xmlns:mc="http://schemas.openxmlformats.org/markup-compatibility/2006" xmlns:aink="http://schemas.microsoft.com/office/drawing/2016/ink" xmlns:am3d="http://schemas.microsoft.com/office/drawing/2017/model3d" xmlns:o="urn:schemas-microsoft-com:office:office" xmlns:oel="http://schemas.microsoft.com/office/2019/extlst" xmlns:r="http://schemas.openxmlformats.org/officeDocument/2006/relationships" xmlns:m="http://schemas.openxmlformats.org/officeDocument/2006/math" xmlns:v="urn:schemas-microsoft-com:vml" xmlns:wp14="http://schemas.microsoft.com/office/word/2010/wordprocessingDrawing" xmlns:wp="http://schemas.openxmlformats.org/drawingml/2006/wordprocessingDrawing" xmlns:w10="urn:schemas-microsoft-com:office:word" xmlns:w="http://schemas.openxmlformats.org/wordprocessingml/2006/main" xmlns:w14="http://schemas.microsoft.com/office/word/2010/wordml" xmlns:w15="http://schemas.microsoft.com/office/word/2012/wordml" xmlns:w16cex="http://schemas.microsoft.com/office/word/2018/wordml/cex" xmlns:w16cid="http://schemas.microsoft.com/office/word/2016/wordml/cid" xmlns:w16="http://schemas.microsoft.com/office/word/2018/wordml" xmlns:w16du="http://schemas.microsoft.com/office/word/2023/wordml/word16du" xmlns:w16sdtdh="http://schemas.microsoft.com/office/word/2020/wordml/sdtdatahash" xmlns:w16sdtfl="http://schemas.microsoft.com/office/word/2024/wordml/sdtformatlock" xmlns:w16se="http://schemas.microsoft.com/office/word/2015/wordml/symex" xmlns:wpg="http://schemas.microsoft.com/office/word/2010/wordprocessingGroup" xmlns:wpi="http://schemas.microsoft.com/office/word/2010/wordprocessingInk" xmlns:wne="http://schemas.microsoft.com/office/word/2006/wordml" xmlns:wps="http://schemas.microsoft.com/office/word/2010/wordprocessingShape" mc:Ignorable="w14 w15 w16se w16cid w16 w16cex w16sdtdh w16sdtfl w16du wp14">
   <w:abstractNum w:abstractNumId="0" w15:restartNumberingAfterBreak="0">
     <w:nsid w:val="36BE5F31"/>
     <w:multiLevelType w:val="hybridMultilevel"/>
@@ -1845,7 +3390,7 @@
 </file>
 
 <file path=word/styles.xml><?xml version="1.0" encoding="utf-8"?>
-<w:styles xmlns:mc="http://schemas.openxmlformats.org/markup-compatibility/2006" xmlns:r="http://schemas.openxmlformats.org/officeDocument/2006/relationships" xmlns:w="http://schemas.openxmlformats.org/wordprocessingml/2006/main" xmlns:w14="http://schemas.microsoft.com/office/word/2010/wordml" xmlns:w15="http://schemas.microsoft.com/office/word/2012/wordml" xmlns:w16cex="http://schemas.microsoft.com/office/word/2018/wordml/cex" xmlns:w16cid="http://schemas.microsoft.com/office/word/2016/wordml/cid" xmlns:w16="http://schemas.microsoft.com/office/word/2018/wordml" xmlns:w16sdtdh="http://schemas.microsoft.com/office/word/2020/wordml/sdtdatahash" xmlns:w16se="http://schemas.microsoft.com/office/word/2015/wordml/symex" mc:Ignorable="w14 w15 w16se w16cid w16 w16cex w16sdtdh">
+<w:styles xmlns:mc="http://schemas.openxmlformats.org/markup-compatibility/2006" xmlns:r="http://schemas.openxmlformats.org/officeDocument/2006/relationships" xmlns:w="http://schemas.openxmlformats.org/wordprocessingml/2006/main" xmlns:w14="http://schemas.microsoft.com/office/word/2010/wordml" xmlns:w15="http://schemas.microsoft.com/office/word/2012/wordml" xmlns:w16cex="http://schemas.microsoft.com/office/word/2018/wordml/cex" xmlns:w16cid="http://schemas.microsoft.com/office/word/2016/wordml/cid" xmlns:w16="http://schemas.microsoft.com/office/word/2018/wordml" xmlns:w16du="http://schemas.microsoft.com/office/word/2023/wordml/word16du" xmlns:w16sdtdh="http://schemas.microsoft.com/office/word/2020/wordml/sdtdatahash" xmlns:w16sdtfl="http://schemas.microsoft.com/office/word/2024/wordml/sdtformatlock" xmlns:w16se="http://schemas.microsoft.com/office/word/2015/wordml/symex" mc:Ignorable="w14 w15 w16se w16cid w16 w16cex w16sdtdh w16sdtfl w16du">
   <w:docDefaults>
     <w:rPrDefault>
       <w:rPr>
@@ -2251,6 +3796,7 @@
   <w:style w:type="character" w:default="1" w:styleId="DefaultParagraphFont">
     <w:name w:val="Default Paragraph Font"/>
     <w:uiPriority w:val="1"/>
+    <w:semiHidden/>
     <w:unhideWhenUsed/>
   </w:style>
   <w:style w:type="table" w:default="1" w:styleId="TableNormal">
@@ -2338,6 +3884,62 @@
       <w:ind w:left="720"/>
       <w:contextualSpacing/>
     </w:pPr>
+  </w:style>
+  <w:style w:type="paragraph" w:styleId="Header">
+    <w:name w:val="header"/>
+    <w:basedOn w:val="Normal"/>
+    <w:link w:val="HeaderChar"/>
+    <w:uiPriority w:val="99"/>
+    <w:unhideWhenUsed/>
+    <w:rsid w:val="00A04726"/>
+    <w:pPr>
+      <w:tabs>
+        <w:tab w:val="center" w:pos="4680"/>
+        <w:tab w:val="right" w:pos="9360"/>
+      </w:tabs>
+      <w:spacing w:after="0" w:line="240" w:lineRule="auto"/>
+    </w:pPr>
+  </w:style>
+  <w:style w:type="character" w:customStyle="1" w:styleId="HeaderChar">
+    <w:name w:val="Header Char"/>
+    <w:basedOn w:val="DefaultParagraphFont"/>
+    <w:link w:val="Header"/>
+    <w:uiPriority w:val="99"/>
+    <w:rsid w:val="00A04726"/>
+    <w:rPr>
+      <w:rFonts w:ascii="Calibri" w:eastAsia="Calibri" w:hAnsi="Calibri" w:cs="Calibri"/>
+      <w:sz w:val="22"/>
+      <w:szCs w:val="22"/>
+      <w:lang w:eastAsia="ar-SA"/>
+    </w:rPr>
+  </w:style>
+  <w:style w:type="paragraph" w:styleId="Footer">
+    <w:name w:val="footer"/>
+    <w:basedOn w:val="Normal"/>
+    <w:link w:val="FooterChar"/>
+    <w:uiPriority w:val="99"/>
+    <w:unhideWhenUsed/>
+    <w:rsid w:val="00A04726"/>
+    <w:pPr>
+      <w:tabs>
+        <w:tab w:val="center" w:pos="4680"/>
+        <w:tab w:val="right" w:pos="9360"/>
+      </w:tabs>
+      <w:spacing w:after="0" w:line="240" w:lineRule="auto"/>
+    </w:pPr>
+  </w:style>
+  <w:style w:type="character" w:customStyle="1" w:styleId="FooterChar">
+    <w:name w:val="Footer Char"/>
+    <w:basedOn w:val="DefaultParagraphFont"/>
+    <w:link w:val="Footer"/>
+    <w:uiPriority w:val="99"/>
+    <w:rsid w:val="00A04726"/>
+    <w:rPr>
+      <w:rFonts w:ascii="Calibri" w:eastAsia="Calibri" w:hAnsi="Calibri" w:cs="Calibri"/>
+      <w:sz w:val="22"/>
+      <w:szCs w:val="22"/>
+      <w:lang w:eastAsia="ar-SA"/>
+    </w:rPr>
   </w:style>
 </w:styles>
 </file>
@@ -2635,4 +4237,16 @@
     </a:ext>
   </a:extLst>
 </a:theme>
+</file>
+
+<file path=customXml/item1.xml><?xml version="1.0" encoding="utf-8"?>
+<b:Sources xmlns:b="http://schemas.openxmlformats.org/officeDocument/2006/bibliography" xmlns="http://schemas.openxmlformats.org/officeDocument/2006/bibliography" SelectedStyle="\APASixthEditionOfficeOnline.xsl" StyleName="APA" Version="6"/>
+</file>
+
+<file path=customXml/itemProps1.xml><?xml version="1.0" encoding="utf-8"?>
+<ds:datastoreItem xmlns:ds="http://schemas.openxmlformats.org/officeDocument/2006/customXml" ds:itemID="{59FBD797-53AD-47F4-9628-D93150441E9C}">
+  <ds:schemaRefs>
+    <ds:schemaRef ds:uri="http://schemas.openxmlformats.org/officeDocument/2006/bibliography"/>
+  </ds:schemaRefs>
+</ds:datastoreItem>
 </file>
</xml_diff>